<commit_message>
Add new version of CV
Closes #339
</commit_message>
<xml_diff>
--- a/_static/xander-harris.docx
+++ b/_static/xander-harris.docx
@@ -173,13 +173,7 @@
         <w:rPr>
           <w:rFonts w:ascii="Liberation Serif" w:hAnsi="Liberation Serif"/>
         </w:rPr>
-        <w:t xml:space="preserve">A </w:t>
-      </w:r>
-      <w:r>
-        <w:rPr>
-          <w:rFonts w:ascii="Liberation Serif" w:hAnsi="Liberation Serif"/>
-        </w:rPr>
-        <w:t>straight shooter with upper management written all over him.</w:t>
+        <w:t>A straight shooter with upper management written all over him.</w:t>
       </w:r>
     </w:p>
     <w:p>
@@ -1135,7 +1129,7 @@
       </w:pPr>
       <w:r>
         <w:rPr/>
-        <w:t>GKE (Google Kubernetes Engine)</w:t>
+        <w:t>Google Kubernetes Engine (Google Kubernetes Engine)</w:t>
       </w:r>
     </w:p>
     <w:p>
@@ -1173,7 +1167,7 @@
       </w:pPr>
       <w:r>
         <w:rPr/>
-        <w:t>EKS (Elastic Kubernetes Service)</w:t>
+        <w:t>Elastic Kubernetes Service (Elastic Kubernetes Service)</w:t>
       </w:r>
     </w:p>
     <w:p>
@@ -1544,21 +1538,21 @@
       </w:pPr>
       <w:r>
         <w:rPr/>
-        <w:t>Built and deployed containers to EKS clusters using ECR, GCE, and Docker.</w:t>
-      </w:r>
-    </w:p>
-    <w:p>
-      <w:pPr>
-        <w:pStyle w:val="ListBullet"/>
-        <w:numPr>
-          <w:ilvl w:val="0"/>
-          <w:numId w:val="7"/>
-        </w:numPr>
-        <w:rPr/>
-      </w:pPr>
-      <w:r>
-        <w:rPr/>
-        <w:t>Deployed custom services written in Go and Haskell to EKS clusters using GCE, Ansible, shell scripting and Helm.</w:t>
+        <w:t>Built and deployed containers to Elastic Kubernetes Service clusters using ECR, GCE, and Docker.</w:t>
+      </w:r>
+    </w:p>
+    <w:p>
+      <w:pPr>
+        <w:pStyle w:val="ListBullet"/>
+        <w:numPr>
+          <w:ilvl w:val="0"/>
+          <w:numId w:val="7"/>
+        </w:numPr>
+        <w:rPr/>
+      </w:pPr>
+      <w:r>
+        <w:rPr/>
+        <w:t>Deployed custom services written in Go and Haskell to Elastic Kubernetes Service clusters using GCE, Ansible, shell scripting and Helm.</w:t>
       </w:r>
     </w:p>
     <w:p>
@@ -1628,7 +1622,19 @@
         <w:rPr>
           <w:rStyle w:val="SubtleReference"/>
         </w:rPr>
-        <w:t>git, neovim, nix, GitLab CI, Docker, BASH, Go, GCP GKE, Google Compute Engine, AWS S3, AWS EKS, quay.io, PostgreSQL, Terraform, HCP Terraform, Python, Linux System Administration</w:t>
+        <w:t>git, neovim, nix, GitLab CI, Docker, BASH, Go, GCP Google Kubernetes Engine, Google Compute Engine, AWS S3, AWS Elastic Kubernetes Service, quay.io, PostgreSQL, Terraform, HCP Terraform, Python, Linux System Administration</w:t>
+      </w:r>
+      <w:r>
+        <w:br w:type="page"/>
+      </w:r>
+    </w:p>
+    <w:p>
+      <w:pPr>
+        <w:pStyle w:val="Normal"/>
+        <w:rPr/>
+      </w:pPr>
+      <w:r>
+        <w:rPr/>
       </w:r>
     </w:p>
     <w:p>
@@ -1654,16 +1660,6 @@
         <w:tab/>
         <w:tab/>
         <w:tab/>
-      </w:r>
-      <w:r>
-        <w:rPr>
-          <w:rStyle w:val="SubtleReference"/>
-          <w:b/>
-          <w:bCs/>
-          <w:color w:val="374C80"/>
-          <w:sz w:val="22"/>
-          <w:szCs w:val="22"/>
-        </w:rPr>
         <w:t>ML Software Engineer (8-2024 – 10-2024)</w:t>
       </w:r>
     </w:p>
@@ -1856,7 +1852,7 @@
       </w:pPr>
       <w:r>
         <w:rPr/>
-        <w:t>Provided advice to and received requirements from development teams on the most cost-effective use of cloud resources, including deployments to EKS, VPCs, S3, Cognito and Lambda.</w:t>
+        <w:t>Provided advice to and received requirements from development teams on the most cost-effective use of cloud resources, including deployments to Elastic Kubernetes Service, VPCs, S3, Cognito and Lambda.</w:t>
       </w:r>
     </w:p>
     <w:p>
@@ -1884,7 +1880,7 @@
         <w:rPr>
           <w:rStyle w:val="SubtleReference"/>
         </w:rPr>
-        <w:t>vscode, vim, GitLab CI, Docker, BASH, Go, GCP GKE, Compute Engine, Cloud Storage, Networking, Cloud SQL, Terraform, Python, git, Linux System Administration</w:t>
+        <w:t>vscode, vim, GitLab CI, Docker, BASH, Go, GCP Google Kubernetes Engine, Compute Engine, Cloud Storage, Networking, Cloud SQL, Terraform, Python, git, Linux System Administration</w:t>
       </w:r>
     </w:p>
     <w:p>
@@ -1895,17 +1891,10 @@
       </w:pPr>
       <w:r>
         <w:rPr/>
-        <w:t>Wunderkind, I</w:t>
-      </w:r>
-      <w:r>
-        <w:rPr/>
-        <w:t>nc</w:t>
-        <w:tab/>
-        <w:tab/>
-        <w:tab/>
-      </w:r>
-      <w:r>
-        <w:rPr/>
+        <w:t>Wunderkind, Inc</w:t>
+        <w:tab/>
+        <w:tab/>
+        <w:tab/>
         <w:t>DevOps Engineer / Software Engineer (09-2021 - 12-2023)</w:t>
       </w:r>
     </w:p>
@@ -1930,7 +1919,7 @@
       </w:pPr>
       <w:r>
         <w:rPr/>
-        <w:t>Created and maintained Helm charts that were used to deploy custom and open-source software to ~36 GKE clusters.</w:t>
+        <w:t>Created and maintained Helm charts that were used to deploy custom and open-source software to ~36 Google Kubernetes Engine clusters.</w:t>
       </w:r>
     </w:p>
     <w:p>
@@ -2028,7 +2017,7 @@
       </w:pPr>
       <w:r>
         <w:rPr/>
-        <w:t>Deployed opencost.io across all existing GKE clusters that enabled cost analysis via Prometheus and Grafana.</w:t>
+        <w:t>Deployed opencost.io across all existing Google Kubernetes Engine clusters that enabled cost analysis via Prometheus and Grafana.</w:t>
       </w:r>
     </w:p>
     <w:p>
@@ -2079,7 +2068,7 @@
       </w:pPr>
       <w:r>
         <w:rPr/>
-        <w:t>Created Terraform code to deploy or update GKE clusters and node pools to follow organization labeling standards.</w:t>
+        <w:t>Created Terraform code to deploy or update Google Kubernetes Engine clusters and node pools to follow organization labeling standards.</w:t>
       </w:r>
     </w:p>
     <w:p>
@@ -2187,7 +2176,7 @@
         <w:rPr>
           <w:rStyle w:val="SubtleReference"/>
         </w:rPr>
-        <w:t>vscode, vim, GitLab CI, Docker, BASH, Go, GCP GKE, Compute Engine, Cloud Storage, Networking, Cloud SQL, Terraform, Python, git, Linux System Administration</w:t>
+        <w:t>vscode, vim, GitLab CI, Docker, BASH, Go, GCP Google Kubernetes Engine, Compute Engine, Cloud Storage, Networking, Cloud SQL, Terraform, Python, git, Linux System Administration</w:t>
       </w:r>
     </w:p>
     <w:p>
@@ -2330,7 +2319,7 @@
       <w:r>
         <w:rPr>
           <w:rStyle w:val="SubtleReference"/>
-          <w:rFonts w:cs="Times New Roman" w:ascii="Times New Roman" w:hAnsi="Times New Roman"/>
+          <w:rFonts w:cs="Times New Roman"/>
           <w:color w:themeColor="text1" w:themeTint="a5" w:val="5A5A5A"/>
           <w:sz w:val="15"/>
           <w:szCs w:val="15"/>
@@ -2481,7 +2470,7 @@
       </w:pPr>
       <w:r>
         <w:rPr/>
-        <w:t>Created Terraform code to deploy EKS clusters and related ECR repositories in multiple AWS environments.</w:t>
+        <w:t>Created Terraform code to deploy Elastic Kubernetes Service clusters and related ECR repositories in multiple AWS environments.</w:t>
       </w:r>
     </w:p>
     <w:p>
@@ -3443,7 +3432,7 @@
       </w:pPr>
       <w:r>
         <w:rPr/>
-        <w:t>Automated deployment of Customer 360 services to reduce time to deploy from several weeks to less than an hour with Ansible, BASH, Java, Ant, Maven, Tomcat, and Scala Build Tool.</w:t>
+        <w:t>Automated deployment of Customer 360 services to reduce time to deploy from several weElastic Kubernetes Service to less than an hour with Ansible, BASH, Java, Ant, Maven, Tomcat, and Scala Build Tool.</w:t>
       </w:r>
     </w:p>
     <w:p>
@@ -3605,7 +3594,7 @@
 <w:ftr xmlns:o="urn:schemas-microsoft-com:office:office" xmlns:r="http://schemas.openxmlformats.org/officeDocument/2006/relationships" xmlns:v="urn:schemas-microsoft-com:vml" xmlns:w="http://schemas.openxmlformats.org/wordprocessingml/2006/main" xmlns:w10="urn:schemas-microsoft-com:office:word" xmlns:wp="http://schemas.openxmlformats.org/drawingml/2006/wordprocessingDrawing" xmlns:pic="http://schemas.openxmlformats.org/drawingml/2006/picture" xmlns:wps="http://schemas.microsoft.com/office/word/2010/wordprocessingShape" xmlns:wpg="http://schemas.microsoft.com/office/word/2010/wordprocessingGroup" xmlns:mc="http://schemas.openxmlformats.org/markup-compatibility/2006" xmlns:wp14="http://schemas.microsoft.com/office/word/2010/wordprocessingDrawing" xmlns:w14="http://schemas.microsoft.com/office/word/2010/wordml" xmlns:w15="http://schemas.microsoft.com/office/word/2012/wordml" mc:Ignorable="w14 wp14 w15">
   <w:p>
     <w:pPr>
-      <w:pStyle w:val="FooterLeft"/>
+      <w:pStyle w:val="FooterLeftuser"/>
       <w:rPr/>
     </w:pPr>
     <w:r>
@@ -3620,7 +3609,7 @@
 <w:ftr xmlns:o="urn:schemas-microsoft-com:office:office" xmlns:r="http://schemas.openxmlformats.org/officeDocument/2006/relationships" xmlns:v="urn:schemas-microsoft-com:vml" xmlns:w="http://schemas.openxmlformats.org/wordprocessingml/2006/main" xmlns:w10="urn:schemas-microsoft-com:office:word" xmlns:wp="http://schemas.openxmlformats.org/drawingml/2006/wordprocessingDrawing" xmlns:pic="http://schemas.openxmlformats.org/drawingml/2006/picture" xmlns:wps="http://schemas.microsoft.com/office/word/2010/wordprocessingShape" xmlns:wpg="http://schemas.microsoft.com/office/word/2010/wordprocessingGroup" xmlns:mc="http://schemas.openxmlformats.org/markup-compatibility/2006" xmlns:wp14="http://schemas.microsoft.com/office/word/2010/wordprocessingDrawing" xmlns:w14="http://schemas.microsoft.com/office/word/2010/wordml" xmlns:w15="http://schemas.microsoft.com/office/word/2012/wordml" mc:Ignorable="w14 wp14 w15">
   <w:p>
     <w:pPr>
-      <w:pStyle w:val="FooterLeft"/>
+      <w:pStyle w:val="FooterLeftuser"/>
       <w:rPr/>
     </w:pPr>
     <w:r>
@@ -4010,10 +3999,10 @@
       </w:pPr>
       <w:rPr>
         <w:rFonts w:ascii="Symbol" w:hAnsi="Symbol" w:cs="Symbol" w:hint="default"/>
-        <w:sz w:val="16"/>
+        <w:color w:themeColor="accent1" w:themeShade="bf" w:val="374C80"/>
         <w:spacing w:val="0"/>
         <w:kern w:val="0"/>
-        <w:color w:themeColor="accent1" w:themeShade="bf" w:val="374C80"/>
+        <w:sz w:val="16"/>
       </w:rPr>
     </w:lvl>
     <w:lvl w:ilvl="1">
@@ -5636,15 +5625,15 @@
     <w:qFormat/>
     <w:rPr/>
   </w:style>
-  <w:style w:type="character" w:styleId="Bulletsuser">
-    <w:name w:val="Bullets (user)"/>
+  <w:style w:type="character" w:styleId="Bullets">
+    <w:name w:val="Bullets"/>
     <w:qFormat/>
     <w:rPr>
       <w:rFonts w:ascii="OpenSymbol" w:hAnsi="OpenSymbol" w:eastAsia="OpenSymbol" w:cs="OpenSymbol"/>
     </w:rPr>
   </w:style>
-  <w:style w:type="character" w:styleId="Bullets">
-    <w:name w:val="Bullets"/>
+  <w:style w:type="character" w:styleId="Bulletsuser">
+    <w:name w:val="Bullets (user)"/>
     <w:qFormat/>
     <w:rPr>
       <w:rFonts w:ascii="OpenSymbol" w:hAnsi="OpenSymbol" w:eastAsia="OpenSymbol" w:cs="OpenSymbol"/>
@@ -5981,8 +5970,8 @@
       <w:rFonts w:ascii="times" w:hAnsi="times"/>
     </w:rPr>
   </w:style>
-  <w:style w:type="paragraph" w:styleId="FrameContentsuser">
-    <w:name w:val="Frame Contents (user)"/>
+  <w:style w:type="paragraph" w:styleId="FrameContents">
+    <w:name w:val="Frame Contents"/>
     <w:basedOn w:val="Normal"/>
     <w:qFormat/>
     <w:pPr/>
@@ -6018,8 +6007,8 @@
     </w:pPr>
     <w:rPr/>
   </w:style>
-  <w:style w:type="paragraph" w:styleId="FooterLeft">
-    <w:name w:val="Footer Left"/>
+  <w:style w:type="paragraph" w:styleId="FooterLeftuser">
+    <w:name w:val="Footer Left (user)"/>
     <w:basedOn w:val="Footer"/>
     <w:qFormat/>
     <w:pPr>
@@ -6043,8 +6032,8 @@
       <w:bCs/>
     </w:rPr>
   </w:style>
-  <w:style w:type="paragraph" w:styleId="FrameContents">
-    <w:name w:val="Frame Contents"/>
+  <w:style w:type="paragraph" w:styleId="FrameContentsuser">
+    <w:name w:val="Frame Contents (user)"/>
     <w:basedOn w:val="Normal"/>
     <w:qFormat/>
     <w:pPr/>
@@ -6087,8 +6076,8 @@
     <w:qFormat/>
     <w:rsid w:val="00512907"/>
   </w:style>
-  <w:style w:type="numbering" w:styleId="Bulletuser">
-    <w:name w:val="Bullet • (user)"/>
+  <w:style w:type="numbering" w:styleId="Bullet">
+    <w:name w:val="Bullet •"/>
     <w:qFormat/>
   </w:style>
   <w:style w:type="table" w:default="1" w:styleId="TableNormal">
@@ -6112,9 +6101,9 @@
     <w:rsid w:val="00ba2a03"/>
     <w:rPr>
       <w:rFonts w:asciiTheme="minorHAnsi" w:hAnsiTheme="minorHAnsi" w:eastAsiaTheme="minorEastAsia" w:cstheme="minorBidi"/>
-      <w:lang w:eastAsia="ja-JP"/>
       <w:sz w:val="22"/>
       <w:szCs w:val="22"/>
+      <w:lang w:eastAsia="ja-JP"/>
     </w:rPr>
     <w:tblPr>
       <w:tblBorders>

</xml_diff>

<commit_message>
Update to latest version
Closes #371
</commit_message>
<xml_diff>
--- a/_static/xander-harris.docx
+++ b/_static/xander-harris.docx
@@ -197,1256 +197,739 @@
     </w:p>
     <w:p>
       <w:pPr>
+        <w:pStyle w:val="Heading3"/>
+        <w:rPr/>
+      </w:pPr>
+      <w:r>
+        <w:rPr/>
+        <w:t>Automation</w:t>
+      </w:r>
+    </w:p>
+    <w:p>
+      <w:pPr>
+        <w:pStyle w:val="Heading3"/>
+        <w:spacing w:before="0" w:after="0"/>
+        <w:rPr>
+          <w:vanish/>
+          <w:specVanish/>
+        </w:rPr>
+      </w:pPr>
+      <w:r>
+        <w:rPr/>
+        <w:t>OSS</w:t>
+      </w:r>
+    </w:p>
+    <w:p>
+      <w:pPr>
+        <w:pStyle w:val="PreformattedText"/>
+        <w:rPr/>
+      </w:pPr>
+      <w:r/>
+      <w:r>
+        <w:rPr/>
+      </w:r>
+      <w:r>
+        <w:rPr/>
+        <w:t xml:space="preserve"> </w:t>
+      </w:r>
+      <w:r>
+        <w:rPr/>
+        <w:t>| Terraform, Ansible, Jenkins</w:t>
+      </w:r>
+    </w:p>
+    <w:p>
+      <w:pPr>
+        <w:pStyle w:val="Heading3"/>
+        <w:spacing w:before="0" w:after="0"/>
+        <w:rPr>
+          <w:vanish/>
+          <w:specVanish/>
+        </w:rPr>
+      </w:pPr>
+      <w:r>
+        <w:rPr/>
+        <w:t>Google Cloud</w:t>
+      </w:r>
+    </w:p>
+    <w:p>
+      <w:pPr>
+        <w:pStyle w:val="PreformattedText"/>
+        <w:rPr/>
+      </w:pPr>
+      <w:r/>
+      <w:r>
+        <w:rPr/>
+      </w:r>
+      <w:r>
+        <w:rPr/>
+        <w:t xml:space="preserve"> </w:t>
+      </w:r>
+      <w:r>
+        <w:rPr/>
+        <w:t>|GDM</w:t>
+      </w:r>
+    </w:p>
+    <w:p>
+      <w:pPr>
+        <w:pStyle w:val="Heading3"/>
+        <w:spacing w:before="0" w:after="0"/>
+        <w:rPr>
+          <w:vanish/>
+          <w:specVanish/>
+        </w:rPr>
+      </w:pPr>
+      <w:r>
+        <w:rPr/>
+        <w:t>AWS</w:t>
+      </w:r>
+    </w:p>
+    <w:p>
+      <w:pPr>
+        <w:pStyle w:val="PreformattedText"/>
+        <w:rPr/>
+      </w:pPr>
+      <w:r/>
+      <w:r>
+        <w:rPr/>
+      </w:r>
+      <w:r>
+        <w:rPr/>
+        <w:t xml:space="preserve"> </w:t>
+      </w:r>
+      <w:r>
+        <w:rPr/>
+        <w:t>| Cloud Formation, CDK</w:t>
+      </w:r>
+    </w:p>
+    <w:p>
+      <w:pPr>
+        <w:pStyle w:val="Heading3"/>
+        <w:rPr/>
+      </w:pPr>
+      <w:r>
+        <w:rPr/>
+        <w:t>Monitoring</w:t>
+      </w:r>
+    </w:p>
+    <w:p>
+      <w:pPr>
+        <w:pStyle w:val="Heading4"/>
+        <w:spacing w:before="0" w:after="0"/>
+        <w:rPr>
+          <w:vanish/>
+          <w:specVanish/>
+        </w:rPr>
+      </w:pPr>
+      <w:r>
+        <w:rPr/>
+        <w:t>OSS</w:t>
+      </w:r>
+    </w:p>
+    <w:p>
+      <w:pPr>
+        <w:pStyle w:val="PreformattedText"/>
+        <w:rPr/>
+      </w:pPr>
+      <w:r/>
+      <w:r>
+        <w:rPr/>
+      </w:r>
+      <w:r>
+        <w:rPr/>
+        <w:t xml:space="preserve"> </w:t>
+      </w:r>
+      <w:r>
+        <w:rPr/>
+        <w:t>| Prometheus, Grafana, Thanos, AlertManager, Loki</w:t>
+      </w:r>
+    </w:p>
+    <w:p>
+      <w:pPr>
+        <w:pStyle w:val="Heading4"/>
+        <w:spacing w:before="0" w:after="0"/>
+        <w:rPr>
+          <w:vanish/>
+          <w:specVanish/>
+        </w:rPr>
+      </w:pPr>
+      <w:r>
+        <w:rPr/>
+        <w:t>Monititoring as a Service</w:t>
+      </w:r>
+    </w:p>
+    <w:p>
+      <w:pPr>
+        <w:pStyle w:val="PreformattedText"/>
+        <w:rPr/>
+      </w:pPr>
+      <w:r/>
+      <w:r>
+        <w:rPr/>
+      </w:r>
+      <w:r>
+        <w:rPr/>
+        <w:t xml:space="preserve"> </w:t>
+      </w:r>
+      <w:r>
+        <w:rPr/>
+        <w:t>| NewRelic, DataDog, StackDriver, ServiceNow</w:t>
+      </w:r>
+    </w:p>
+    <w:p>
+      <w:pPr>
+        <w:pStyle w:val="Heading3"/>
+        <w:rPr/>
+      </w:pPr>
+      <w:r>
+        <w:rPr/>
+        <w:t>Networking</w:t>
+      </w:r>
+    </w:p>
+    <w:p>
+      <w:pPr>
+        <w:pStyle w:val="Heading4"/>
+        <w:spacing w:before="0" w:after="0"/>
+        <w:rPr>
+          <w:vanish/>
+          <w:specVanish/>
+        </w:rPr>
+      </w:pPr>
+      <w:r>
+        <w:rPr/>
+        <w:t xml:space="preserve">GCP/AWS </w:t>
+      </w:r>
+    </w:p>
+    <w:p>
+      <w:pPr>
+        <w:pStyle w:val="PreformattedText"/>
+        <w:rPr/>
+      </w:pPr>
+      <w:r/>
+      <w:r>
+        <w:rPr/>
+      </w:r>
+      <w:r>
+        <w:rPr/>
+        <w:t xml:space="preserve"> </w:t>
+      </w:r>
+      <w:r>
+        <w:rPr/>
+        <w:t>|</w:t>
+      </w:r>
+      <w:r>
+        <w:rPr/>
+        <w:t xml:space="preserve"> VPCs, Subnets, Security Groups, Firewalls</w:t>
+      </w:r>
+    </w:p>
+    <w:p>
+      <w:pPr>
+        <w:pStyle w:val="Heading4"/>
+        <w:spacing w:before="0" w:after="0"/>
+        <w:rPr>
+          <w:vanish/>
+          <w:specVanish/>
+        </w:rPr>
+      </w:pPr>
+      <w:r>
+        <w:rPr/>
+        <w:t>General</w:t>
+      </w:r>
+    </w:p>
+    <w:p>
+      <w:pPr>
+        <w:pStyle w:val="PreformattedText"/>
+        <w:rPr/>
+      </w:pPr>
+      <w:r/>
+      <w:r>
+        <w:rPr/>
+      </w:r>
+      <w:r>
+        <w:rPr/>
+        <w:t xml:space="preserve"> </w:t>
+      </w:r>
+      <w:r>
+        <w:rPr/>
+        <w:t>| TCP/IP, UDP, E2E Encryption</w:t>
+      </w:r>
+    </w:p>
+    <w:p>
+      <w:pPr>
+        <w:pStyle w:val="Heading3"/>
+        <w:rPr/>
+      </w:pPr>
+      <w:r>
+        <w:rPr/>
+        <w:t>Databases</w:t>
+      </w:r>
+    </w:p>
+    <w:p>
+      <w:pPr>
+        <w:pStyle w:val="Heading4"/>
+        <w:spacing w:before="0" w:after="0"/>
+        <w:rPr>
+          <w:vanish/>
+          <w:specVanish/>
+        </w:rPr>
+      </w:pPr>
+      <w:r>
+        <w:rPr/>
+        <w:t>Relational Databases</w:t>
+      </w:r>
+    </w:p>
+    <w:p>
+      <w:pPr>
+        <w:pStyle w:val="PreformattedText"/>
+        <w:rPr/>
+      </w:pPr>
+      <w:r/>
+      <w:r>
+        <w:rPr/>
+      </w:r>
+      <w:r>
+        <w:rPr/>
+        <w:t xml:space="preserve"> </w:t>
+      </w:r>
+      <w:r>
+        <w:rPr/>
+        <w:t>| PostgreSQL, MariaDB, MySQL, MSSQL</w:t>
+      </w:r>
+    </w:p>
+    <w:p>
+      <w:pPr>
+        <w:pStyle w:val="Heading4"/>
+        <w:spacing w:before="0" w:after="0"/>
+        <w:rPr>
+          <w:vanish/>
+          <w:specVanish/>
+        </w:rPr>
+      </w:pPr>
+      <w:r>
+        <w:rPr/>
+        <w:t>NoSQL/Big Data</w:t>
+      </w:r>
+    </w:p>
+    <w:p>
+      <w:pPr>
+        <w:pStyle w:val="PreformattedText"/>
+        <w:rPr/>
+      </w:pPr>
+      <w:r/>
+      <w:r>
+        <w:rPr/>
+      </w:r>
+      <w:r>
+        <w:rPr/>
+        <w:t xml:space="preserve"> </w:t>
+      </w:r>
+      <w:r>
+        <w:rPr/>
+        <w:t>| MongoDB, DynamoDB, Google Big Table, Google Big Query</w:t>
+      </w:r>
+    </w:p>
+    <w:p>
+      <w:pPr>
+        <w:pStyle w:val="Heading3"/>
+        <w:rPr/>
+      </w:pPr>
+      <w:r>
+        <w:rPr/>
+        <w:t>Languages</w:t>
+      </w:r>
+    </w:p>
+    <w:p>
+      <w:pPr>
+        <w:pStyle w:val="Heading4"/>
+        <w:spacing w:before="0" w:after="0"/>
+        <w:rPr>
+          <w:vanish/>
+          <w:specVanish/>
+        </w:rPr>
+      </w:pPr>
+      <w:r>
+        <w:rPr/>
+        <w:t>Programming</w:t>
+      </w:r>
+    </w:p>
+    <w:p>
+      <w:pPr>
+        <w:pStyle w:val="PreformattedText"/>
+        <w:rPr/>
+      </w:pPr>
+      <w:r/>
+      <w:r>
+        <w:rPr/>
+      </w:r>
+      <w:r>
+        <w:rPr/>
+        <w:t xml:space="preserve"> </w:t>
+      </w:r>
+      <w:r>
+        <w:rPr/>
+        <w:t>| Python, Go (Golang), C/C++, Java, JavaScript</w:t>
+      </w:r>
+    </w:p>
+    <w:p>
+      <w:pPr>
+        <w:pStyle w:val="Heading4"/>
+        <w:spacing w:before="0" w:after="0"/>
+        <w:rPr>
+          <w:vanish/>
+          <w:specVanish/>
+        </w:rPr>
+      </w:pPr>
+      <w:r>
+        <w:rPr/>
+        <w:t xml:space="preserve">Scripting </w:t>
+      </w:r>
+    </w:p>
+    <w:p>
+      <w:pPr>
+        <w:pStyle w:val="PreformattedText"/>
+        <w:rPr/>
+      </w:pPr>
+      <w:r/>
+      <w:r>
+        <w:rPr/>
+      </w:r>
+      <w:r>
+        <w:rPr/>
+        <w:t>| Shell, BASH, PowerShell, Nix</w:t>
+      </w:r>
+    </w:p>
+    <w:p>
+      <w:pPr>
+        <w:pStyle w:val="Heading4"/>
+        <w:spacing w:before="0" w:after="0"/>
+        <w:rPr>
+          <w:vanish/>
+          <w:specVanish/>
+        </w:rPr>
+      </w:pPr>
+      <w:r>
+        <w:rPr/>
+        <w:t>Markup</w:t>
+      </w:r>
+    </w:p>
+    <w:p>
+      <w:pPr>
+        <w:pStyle w:val="PreformattedText"/>
+        <w:rPr/>
+      </w:pPr>
+      <w:r/>
+      <w:r>
+        <w:rPr/>
+      </w:r>
+      <w:r>
+        <w:rPr/>
+        <w:t xml:space="preserve"> </w:t>
+      </w:r>
+      <w:r>
+        <w:rPr/>
+        <w:t>| Markdown, XML, HTML, YAML</w:t>
+      </w:r>
+    </w:p>
+    <w:p>
+      <w:pPr>
+        <w:pStyle w:val="PreformattedText"/>
+        <w:rPr/>
+      </w:pPr>
+      <w:r>
+        <w:rPr/>
+      </w:r>
+    </w:p>
+    <w:p>
+      <w:pPr>
+        <w:pStyle w:val="Heading3"/>
+        <w:rPr/>
+      </w:pPr>
+      <w:r>
+        <w:rPr/>
+        <w:t>Orchestration</w:t>
+      </w:r>
+    </w:p>
+    <w:p>
+      <w:pPr>
+        <w:pStyle w:val="Heading4"/>
+        <w:spacing w:before="0" w:after="0"/>
+        <w:rPr>
+          <w:vanish/>
+          <w:specVanish/>
+        </w:rPr>
+      </w:pPr>
+      <w:r>
+        <w:rPr/>
+        <w:t>Platforms</w:t>
+      </w:r>
+    </w:p>
+    <w:p>
+      <w:pPr>
+        <w:pStyle w:val="PreformattedText"/>
+        <w:rPr/>
+      </w:pPr>
+      <w:r/>
+      <w:r>
+        <w:rPr/>
+      </w:r>
+      <w:r>
+        <w:rPr/>
+        <w:t xml:space="preserve"> </w:t>
+      </w:r>
+      <w:r>
+        <w:rPr/>
+        <w:t>| Bare-metal Kubernetes, Managed Kubernetes, Docker Enterprise, Container D, CRI-O</w:t>
+      </w:r>
+    </w:p>
+    <w:p>
+      <w:pPr>
+        <w:pStyle w:val="Heading4"/>
+        <w:spacing w:before="0" w:after="0"/>
+        <w:rPr>
+          <w:vanish/>
+          <w:specVanish/>
+        </w:rPr>
+      </w:pPr>
+      <w:r>
+        <w:rPr/>
+        <w:t>GCP</w:t>
+      </w:r>
+    </w:p>
+    <w:p>
+      <w:pPr>
+        <w:pStyle w:val="PreformattedText"/>
+        <w:rPr/>
+      </w:pPr>
+      <w:r/>
+      <w:r>
+        <w:rPr/>
+      </w:r>
+      <w:r>
+        <w:rPr/>
+        <w:t xml:space="preserve"> </w:t>
+      </w:r>
+      <w:r>
+        <w:rPr/>
+        <w:t xml:space="preserve">| Google Kubernetes Engine (Google Kubernetes Engine), </w:t>
+      </w:r>
+      <w:r>
+        <w:rPr/>
+        <w:t>GCE (Google Compute Engine)</w:t>
+      </w:r>
+    </w:p>
+    <w:p>
+      <w:pPr>
+        <w:pStyle w:val="Heading4"/>
+        <w:spacing w:before="0" w:after="0"/>
+        <w:rPr>
+          <w:vanish/>
+          <w:specVanish/>
+        </w:rPr>
+      </w:pPr>
+      <w:r>
+        <w:rPr/>
+        <w:t>AWS</w:t>
+      </w:r>
+    </w:p>
+    <w:p>
+      <w:pPr>
+        <w:pStyle w:val="PreformattedText"/>
+        <w:rPr/>
+      </w:pPr>
+      <w:r/>
+      <w:r>
+        <w:rPr/>
+      </w:r>
+      <w:r>
+        <w:rPr/>
+        <w:t xml:space="preserve"> </w:t>
+      </w:r>
+      <w:r>
+        <w:rPr/>
+        <w:t xml:space="preserve">| Elastic Kubernetes Service (Elastic Kubernetes Service), </w:t>
+      </w:r>
+      <w:r>
+        <w:rPr/>
+        <w:t>ECS (Elastic Container Service), EC2 (Elastic Compute Cloud)</w:t>
+      </w:r>
+    </w:p>
+    <w:p>
+      <w:pPr>
+        <w:pStyle w:val="Heading3"/>
+        <w:rPr/>
+      </w:pPr>
+      <w:r>
+        <w:rPr/>
+        <w:t>CI/CD</w:t>
+      </w:r>
+    </w:p>
+    <w:p>
+      <w:pPr>
+        <w:pStyle w:val="Heading4"/>
+        <w:spacing w:before="0" w:after="0"/>
+        <w:rPr>
+          <w:vanish/>
+          <w:specVanish/>
+        </w:rPr>
+      </w:pPr>
+      <w:r>
+        <w:rPr/>
+        <w:t>Build/Delivery</w:t>
+      </w:r>
+    </w:p>
+    <w:p>
+      <w:pPr>
+        <w:pStyle w:val="PreformattedText"/>
+        <w:rPr/>
+      </w:pPr>
+      <w:r/>
+      <w:r>
+        <w:rPr/>
+      </w:r>
+      <w:r>
+        <w:rPr/>
+        <w:t xml:space="preserve"> </w:t>
+      </w:r>
+      <w:r>
+        <w:rPr/>
+        <w:t xml:space="preserve">| Jenkins, </w:t>
+      </w:r>
+      <w:r>
+        <w:rPr/>
+        <w:t>GitLab CI, CircleCI, ArgoCD, Travis CI</w:t>
+      </w:r>
+    </w:p>
+    <w:p>
+      <w:pPr>
+        <w:pStyle w:val="Heading4"/>
+        <w:spacing w:before="0" w:after="0"/>
+        <w:rPr>
+          <w:vanish/>
+          <w:specVanish/>
+        </w:rPr>
+      </w:pPr>
+      <w:r>
+        <w:rPr/>
+        <w:t>Quality</w:t>
+      </w:r>
+    </w:p>
+    <w:p>
+      <w:pPr>
+        <w:pStyle w:val="PreformattedText"/>
+        <w:rPr/>
+      </w:pPr>
+      <w:r/>
+      <w:r>
+        <w:rPr/>
+      </w:r>
+      <w:r>
+        <w:rPr/>
+        <w:t xml:space="preserve"> </w:t>
+      </w:r>
+      <w:r>
+        <w:rPr/>
+        <w:t>| SonarQube,</w:t>
+      </w:r>
+      <w:r>
+        <w:rPr/>
+        <w:t xml:space="preserve"> Code-Climate, CodeCov,</w:t>
+      </w:r>
+      <w:r>
+        <w:rPr/>
+        <w:t xml:space="preserve"> Coveralls.i</w:t>
+      </w:r>
+      <w:r>
+        <w:rPr/>
+        <w:t>o</w:t>
+      </w:r>
+    </w:p>
+    <w:p>
+      <w:pPr>
+        <w:pStyle w:val="Heading3"/>
+        <w:rPr/>
+      </w:pPr>
+      <w:r>
+        <w:rPr/>
+        <w:t>Software Development Life Cycle</w:t>
+      </w:r>
+    </w:p>
+    <w:p>
+      <w:pPr>
+        <w:pStyle w:val="Heading4"/>
+        <w:spacing w:before="0" w:after="0"/>
+        <w:rPr>
+          <w:vanish/>
+          <w:specVanish/>
+        </w:rPr>
+      </w:pPr>
+      <w:r>
+        <w:rPr/>
+        <w:t>Agile</w:t>
+      </w:r>
+    </w:p>
+    <w:p>
+      <w:pPr>
+        <w:pStyle w:val="PreformattedText"/>
+        <w:rPr/>
+      </w:pPr>
+      <w:r/>
+      <w:r>
+        <w:rPr/>
+      </w:r>
+      <w:r>
+        <w:rPr/>
+        <w:t xml:space="preserve"> </w:t>
+      </w:r>
+      <w:r>
+        <w:rPr/>
+        <w:t xml:space="preserve">| SCRUM, </w:t>
+      </w:r>
+      <w:r>
+        <w:rPr/>
+        <w:t>Branching Models</w:t>
+      </w:r>
+    </w:p>
+    <w:p>
+      <w:pPr>
+        <w:pStyle w:val="Heading4"/>
+        <w:spacing w:before="0" w:after="0"/>
+        <w:rPr>
+          <w:vanish/>
+          <w:specVanish/>
+        </w:rPr>
+      </w:pPr>
+      <w:r>
+        <w:rPr/>
+        <w:t>Waterfall</w:t>
+      </w:r>
+    </w:p>
+    <w:p>
+      <w:pPr>
+        <w:pStyle w:val="PreformattedText"/>
+        <w:rPr/>
+      </w:pPr>
+      <w:r/>
+      <w:r>
+        <w:rPr/>
+      </w:r>
+      <w:r>
+        <w:rPr/>
+        <w:t xml:space="preserve"> </w:t>
+      </w:r>
+      <w:r>
+        <w:rPr/>
+        <w:t xml:space="preserve">| Semantic Versioning, </w:t>
+      </w:r>
+      <w:r>
+        <w:rPr/>
+        <w:t>Release Cycles, Commit Cycles</w:t>
+      </w:r>
+    </w:p>
+    <w:p>
+      <w:pPr>
         <w:sectPr>
           <w:type w:val="continuous"/>
           <w:pgSz w:w="12240" w:h="15840"/>
           <w:pgMar w:left="1440" w:right="1440" w:gutter="0" w:header="0" w:top="1440" w:footer="1440" w:bottom="1642"/>
-          <w:formProt w:val="false"/>
-          <w:textDirection w:val="lrTb"/>
-          <w:docGrid w:type="default" w:linePitch="360" w:charSpace="0"/>
-        </w:sectPr>
-      </w:pPr>
-    </w:p>
-    <w:p>
-      <w:pPr>
-        <w:pStyle w:val="Heading3"/>
-        <w:keepNext w:val="true"/>
-        <w:keepLines/>
-        <w:widowControl/>
-        <w:suppressAutoHyphens w:val="true"/>
-        <w:bidi w:val="0"/>
-        <w:spacing w:before="0" w:after="0"/>
-        <w:rPr>
-          <w:rFonts w:ascii="Times New Roman" w:hAnsi="Times New Roman" w:eastAsia="" w:cs="Times New Roman" w:eastAsiaTheme="majorEastAsia"/>
-          <w:b/>
-          <w:bCs/>
-          <w:caps w:val="false"/>
-          <w:smallCaps w:val="false"/>
-          <w:color w:themeColor="accent1" w:val="4A66AC"/>
-          <w:kern w:val="2"/>
-          <w:sz w:val="18"/>
-          <w:szCs w:val="21"/>
-          <w:lang w:val="en-US" w:eastAsia="en-US" w:bidi="ar-SA"/>
-        </w:rPr>
-      </w:pPr>
-      <w:r>
-        <w:rPr>
-          <w:rFonts w:eastAsia="" w:cs="Times New Roman" w:eastAsiaTheme="majorEastAsia"/>
-          <w:b/>
-          <w:bCs/>
-          <w:caps w:val="false"/>
-          <w:smallCaps w:val="false"/>
-          <w:color w:themeColor="accent1" w:val="4A66AC"/>
-          <w:kern w:val="2"/>
-          <w:sz w:val="18"/>
-          <w:szCs w:val="21"/>
-          <w:lang w:val="en-US" w:eastAsia="en-US" w:bidi="ar-SA"/>
-        </w:rPr>
-        <w:t>Automation</w:t>
-      </w:r>
-    </w:p>
-    <w:p>
-      <w:pPr>
-        <w:pStyle w:val="Heading4"/>
-        <w:jc w:val="center"/>
-        <w:rPr/>
-      </w:pPr>
-      <w:r>
-        <w:rPr/>
-        <w:t>OSS</w:t>
-      </w:r>
-    </w:p>
-    <w:p>
-      <w:pPr>
-        <w:pStyle w:val="ListBullet2"/>
-        <w:numPr>
-          <w:ilvl w:val="0"/>
-          <w:numId w:val="6"/>
-        </w:numPr>
-        <w:rPr/>
-      </w:pPr>
-      <w:r>
-        <w:rPr/>
-        <w:t>Terraform</w:t>
-      </w:r>
-    </w:p>
-    <w:p>
-      <w:pPr>
-        <w:pStyle w:val="ListBullet2"/>
-        <w:numPr>
-          <w:ilvl w:val="0"/>
-          <w:numId w:val="6"/>
-        </w:numPr>
-        <w:rPr/>
-      </w:pPr>
-      <w:r>
-        <w:rPr/>
-        <w:t>Ansible</w:t>
-      </w:r>
-    </w:p>
-    <w:p>
-      <w:pPr>
-        <w:pStyle w:val="ListBullet2"/>
-        <w:numPr>
-          <w:ilvl w:val="0"/>
-          <w:numId w:val="6"/>
-        </w:numPr>
-        <w:rPr/>
-      </w:pPr>
-      <w:r>
-        <w:rPr/>
-        <w:t>Jenkins</w:t>
-      </w:r>
-    </w:p>
-    <w:p>
-      <w:pPr>
-        <w:pStyle w:val="Heading4"/>
-        <w:jc w:val="center"/>
-        <w:rPr/>
-      </w:pPr>
-      <w:r>
-        <w:rPr/>
-        <w:t>Google Cloud</w:t>
-      </w:r>
-    </w:p>
-    <w:p>
-      <w:pPr>
-        <w:pStyle w:val="ListBullet2"/>
-        <w:numPr>
-          <w:ilvl w:val="0"/>
-          <w:numId w:val="6"/>
-        </w:numPr>
-        <w:rPr/>
-      </w:pPr>
-      <w:r>
-        <w:rPr/>
-        <w:t>GDM</w:t>
-      </w:r>
-    </w:p>
-    <w:p>
-      <w:pPr>
-        <w:pStyle w:val="Heading4"/>
-        <w:jc w:val="center"/>
-        <w:rPr/>
-      </w:pPr>
-      <w:r>
-        <w:rPr/>
-        <w:t>AWS</w:t>
-      </w:r>
-    </w:p>
-    <w:p>
-      <w:pPr>
-        <w:pStyle w:val="ListBullet2"/>
-        <w:numPr>
-          <w:ilvl w:val="0"/>
-          <w:numId w:val="6"/>
-        </w:numPr>
-        <w:rPr/>
-      </w:pPr>
-      <w:r>
-        <w:rPr/>
-        <w:t>Cloud Formation</w:t>
-      </w:r>
-    </w:p>
-    <w:p>
-      <w:pPr>
-        <w:pStyle w:val="Heading3"/>
-        <w:rPr/>
-      </w:pPr>
-      <w:r>
-        <w:rPr/>
-        <w:t>Monitoring</w:t>
-      </w:r>
-    </w:p>
-    <w:p>
-      <w:pPr>
-        <w:pStyle w:val="Heading4"/>
-        <w:jc w:val="center"/>
-        <w:rPr/>
-      </w:pPr>
-      <w:r>
-        <w:rPr/>
-        <w:t>OSS</w:t>
-      </w:r>
-    </w:p>
-    <w:p>
-      <w:pPr>
-        <w:pStyle w:val="ListBullet2"/>
-        <w:numPr>
-          <w:ilvl w:val="0"/>
-          <w:numId w:val="6"/>
-        </w:numPr>
-        <w:rPr/>
-      </w:pPr>
-      <w:r>
-        <w:rPr/>
-        <w:t>Prometheus</w:t>
-      </w:r>
-    </w:p>
-    <w:p>
-      <w:pPr>
-        <w:pStyle w:val="ListBullet2"/>
-        <w:numPr>
-          <w:ilvl w:val="0"/>
-          <w:numId w:val="6"/>
-        </w:numPr>
-        <w:rPr/>
-      </w:pPr>
-      <w:r>
-        <w:rPr/>
-        <w:t>Grafana</w:t>
-      </w:r>
-    </w:p>
-    <w:p>
-      <w:pPr>
-        <w:pStyle w:val="ListBullet2"/>
-        <w:numPr>
-          <w:ilvl w:val="0"/>
-          <w:numId w:val="6"/>
-        </w:numPr>
-        <w:rPr/>
-      </w:pPr>
-      <w:r>
-        <w:rPr/>
-        <w:t>Thanos</w:t>
-      </w:r>
-    </w:p>
-    <w:p>
-      <w:pPr>
-        <w:pStyle w:val="ListBullet2"/>
-        <w:numPr>
-          <w:ilvl w:val="0"/>
-          <w:numId w:val="6"/>
-        </w:numPr>
-        <w:rPr/>
-      </w:pPr>
-      <w:r>
-        <w:rPr/>
-        <w:t>AlertManager</w:t>
-      </w:r>
-    </w:p>
-    <w:p>
-      <w:pPr>
-        <w:pStyle w:val="ListBullet2"/>
-        <w:numPr>
-          <w:ilvl w:val="0"/>
-          <w:numId w:val="6"/>
-        </w:numPr>
-        <w:rPr/>
-      </w:pPr>
-      <w:r>
-        <w:rPr/>
-        <w:t>Loki</w:t>
-      </w:r>
-    </w:p>
-    <w:p>
-      <w:pPr>
-        <w:pStyle w:val="Heading4"/>
-        <w:jc w:val="center"/>
-        <w:rPr/>
-      </w:pPr>
-      <w:r>
-        <w:rPr/>
-        <w:t>Monitoring</w:t>
-      </w:r>
-    </w:p>
-    <w:p>
-      <w:pPr>
-        <w:pStyle w:val="ListBullet2"/>
-        <w:numPr>
-          <w:ilvl w:val="0"/>
-          <w:numId w:val="6"/>
-        </w:numPr>
-        <w:rPr/>
-      </w:pPr>
-      <w:r>
-        <w:rPr/>
-        <w:t>NewRelic</w:t>
-      </w:r>
-    </w:p>
-    <w:p>
-      <w:pPr>
-        <w:pStyle w:val="ListBullet2"/>
-        <w:numPr>
-          <w:ilvl w:val="0"/>
-          <w:numId w:val="6"/>
-        </w:numPr>
-        <w:rPr/>
-      </w:pPr>
-      <w:r>
-        <w:rPr/>
-        <w:t>DataDog</w:t>
-      </w:r>
-    </w:p>
-    <w:p>
-      <w:pPr>
-        <w:pStyle w:val="ListBullet2"/>
-        <w:numPr>
-          <w:ilvl w:val="0"/>
-          <w:numId w:val="6"/>
-        </w:numPr>
-        <w:rPr/>
-      </w:pPr>
-      <w:r>
-        <w:rPr/>
-        <w:t>StackDriver</w:t>
-      </w:r>
-    </w:p>
-    <w:p>
-      <w:pPr>
-        <w:pStyle w:val="ListBullet2"/>
-        <w:numPr>
-          <w:ilvl w:val="0"/>
-          <w:numId w:val="6"/>
-        </w:numPr>
-        <w:rPr/>
-      </w:pPr>
-      <w:r>
-        <w:rPr/>
-        <w:t>ServiceNow</w:t>
-      </w:r>
-    </w:p>
-    <w:p>
-      <w:pPr>
-        <w:pStyle w:val="Heading3"/>
-        <w:rPr/>
-      </w:pPr>
-      <w:r>
-        <w:rPr/>
-        <w:t>Networking</w:t>
-      </w:r>
-    </w:p>
-    <w:p>
-      <w:pPr>
-        <w:pStyle w:val="Heading4"/>
-        <w:jc w:val="center"/>
-        <w:rPr/>
-      </w:pPr>
-      <w:r>
-        <w:rPr/>
-        <w:t>GCP/AWS</w:t>
-      </w:r>
-    </w:p>
-    <w:p>
-      <w:pPr>
-        <w:pStyle w:val="ListBullet2"/>
-        <w:numPr>
-          <w:ilvl w:val="0"/>
-          <w:numId w:val="6"/>
-        </w:numPr>
-        <w:rPr/>
-      </w:pPr>
-      <w:r>
-        <w:rPr/>
-        <w:t>VPCs</w:t>
-      </w:r>
-    </w:p>
-    <w:p>
-      <w:pPr>
-        <w:pStyle w:val="ListBullet2"/>
-        <w:numPr>
-          <w:ilvl w:val="0"/>
-          <w:numId w:val="6"/>
-        </w:numPr>
-        <w:rPr/>
-      </w:pPr>
-      <w:r>
-        <w:rPr/>
-        <w:t>Subnets</w:t>
-      </w:r>
-    </w:p>
-    <w:p>
-      <w:pPr>
-        <w:pStyle w:val="ListBullet2"/>
-        <w:numPr>
-          <w:ilvl w:val="0"/>
-          <w:numId w:val="6"/>
-        </w:numPr>
-        <w:rPr/>
-      </w:pPr>
-      <w:r>
-        <w:rPr/>
-        <w:t>Security Groups</w:t>
-      </w:r>
-    </w:p>
-    <w:p>
-      <w:pPr>
-        <w:pStyle w:val="ListBullet2"/>
-        <w:numPr>
-          <w:ilvl w:val="0"/>
-          <w:numId w:val="6"/>
-        </w:numPr>
-        <w:rPr/>
-      </w:pPr>
-      <w:r>
-        <w:rPr/>
-        <w:t>Firewalls</w:t>
-      </w:r>
-    </w:p>
-    <w:p>
-      <w:pPr>
-        <w:pStyle w:val="Heading4"/>
-        <w:jc w:val="center"/>
-        <w:rPr>
-          <w:rFonts w:eastAsia="Calibri" w:cs="Courier New" w:eastAsiaTheme="minorHAnsi"/>
-          <w:sz w:val="24"/>
-        </w:rPr>
-      </w:pPr>
-      <w:r>
-        <w:rPr/>
-        <w:t>General</w:t>
-      </w:r>
-    </w:p>
-    <w:p>
-      <w:pPr>
-        <w:pStyle w:val="ListBullet2"/>
-        <w:numPr>
-          <w:ilvl w:val="0"/>
-          <w:numId w:val="6"/>
-        </w:numPr>
-        <w:rPr/>
-      </w:pPr>
-      <w:r>
-        <w:rPr/>
-        <w:t>TCP/IP</w:t>
-      </w:r>
-    </w:p>
-    <w:p>
-      <w:pPr>
-        <w:pStyle w:val="ListBullet2"/>
-        <w:numPr>
-          <w:ilvl w:val="0"/>
-          <w:numId w:val="6"/>
-        </w:numPr>
-        <w:rPr/>
-      </w:pPr>
-      <w:r>
-        <w:rPr/>
-        <w:t>UDP</w:t>
-      </w:r>
-    </w:p>
-    <w:p>
-      <w:pPr>
-        <w:pStyle w:val="ListBullet2"/>
-        <w:numPr>
-          <w:ilvl w:val="0"/>
-          <w:numId w:val="6"/>
-        </w:numPr>
-        <w:rPr/>
-      </w:pPr>
-      <w:r>
-        <w:rPr/>
-        <w:t>E2E Encryption</w:t>
-      </w:r>
-    </w:p>
-    <w:p>
-      <w:pPr>
-        <w:pStyle w:val="Heading3"/>
-        <w:spacing w:before="0" w:after="0"/>
-        <w:rPr/>
-      </w:pPr>
-      <w:r>
-        <w:br w:type="column"/>
-      </w:r>
-      <w:r>
-        <w:rPr/>
-        <w:t>Databases</w:t>
-      </w:r>
-    </w:p>
-    <w:p>
-      <w:pPr>
-        <w:pStyle w:val="Heading4"/>
-        <w:jc w:val="center"/>
-        <w:rPr/>
-      </w:pPr>
-      <w:r>
-        <w:rPr/>
-        <w:t>Relational Databases</w:t>
-      </w:r>
-    </w:p>
-    <w:p>
-      <w:pPr>
-        <w:pStyle w:val="ListBullet2"/>
-        <w:numPr>
-          <w:ilvl w:val="0"/>
-          <w:numId w:val="6"/>
-        </w:numPr>
-        <w:rPr/>
-      </w:pPr>
-      <w:r>
-        <w:rPr/>
-        <w:t>PostgreSQL</w:t>
-      </w:r>
-    </w:p>
-    <w:p>
-      <w:pPr>
-        <w:pStyle w:val="ListBullet2"/>
-        <w:numPr>
-          <w:ilvl w:val="0"/>
-          <w:numId w:val="6"/>
-        </w:numPr>
-        <w:rPr/>
-      </w:pPr>
-      <w:r>
-        <w:rPr/>
-        <w:t>MariaDB</w:t>
-      </w:r>
-    </w:p>
-    <w:p>
-      <w:pPr>
-        <w:pStyle w:val="ListBullet2"/>
-        <w:numPr>
-          <w:ilvl w:val="0"/>
-          <w:numId w:val="6"/>
-        </w:numPr>
-        <w:rPr/>
-      </w:pPr>
-      <w:r>
-        <w:rPr/>
-        <w:t>MySQL</w:t>
-      </w:r>
-    </w:p>
-    <w:p>
-      <w:pPr>
-        <w:pStyle w:val="ListBullet2"/>
-        <w:numPr>
-          <w:ilvl w:val="0"/>
-          <w:numId w:val="6"/>
-        </w:numPr>
-        <w:rPr/>
-      </w:pPr>
-      <w:r>
-        <w:rPr/>
-        <w:t>MSSQL</w:t>
-      </w:r>
-    </w:p>
-    <w:p>
-      <w:pPr>
-        <w:pStyle w:val="Heading4"/>
-        <w:jc w:val="center"/>
-        <w:rPr/>
-      </w:pPr>
-      <w:r>
-        <w:rPr/>
-        <w:t>NoSQL/Big Data</w:t>
-      </w:r>
-    </w:p>
-    <w:p>
-      <w:pPr>
-        <w:pStyle w:val="ListBullet2"/>
-        <w:numPr>
-          <w:ilvl w:val="0"/>
-          <w:numId w:val="6"/>
-        </w:numPr>
-        <w:rPr/>
-      </w:pPr>
-      <w:r>
-        <w:rPr/>
-        <w:t>MongoDB</w:t>
-      </w:r>
-    </w:p>
-    <w:p>
-      <w:pPr>
-        <w:pStyle w:val="ListBullet2"/>
-        <w:numPr>
-          <w:ilvl w:val="0"/>
-          <w:numId w:val="6"/>
-        </w:numPr>
-        <w:rPr/>
-      </w:pPr>
-      <w:r>
-        <w:rPr/>
-        <w:t>DynamoDB</w:t>
-      </w:r>
-    </w:p>
-    <w:p>
-      <w:pPr>
-        <w:pStyle w:val="ListBullet2"/>
-        <w:numPr>
-          <w:ilvl w:val="0"/>
-          <w:numId w:val="6"/>
-        </w:numPr>
-        <w:rPr/>
-      </w:pPr>
-      <w:r>
-        <w:rPr/>
-        <w:t>Google Big Table</w:t>
-      </w:r>
-    </w:p>
-    <w:p>
-      <w:pPr>
-        <w:pStyle w:val="ListBullet2"/>
-        <w:numPr>
-          <w:ilvl w:val="0"/>
-          <w:numId w:val="6"/>
-        </w:numPr>
-        <w:rPr/>
-      </w:pPr>
-      <w:r>
-        <w:rPr/>
-        <w:t>Google Big Query</w:t>
-      </w:r>
-    </w:p>
-    <w:p>
-      <w:pPr>
-        <w:pStyle w:val="Heading3"/>
-        <w:rPr>
-          <w:szCs w:val="16"/>
-        </w:rPr>
-      </w:pPr>
-      <w:r>
-        <w:rPr/>
-        <w:t>Languages</w:t>
-      </w:r>
-    </w:p>
-    <w:p>
-      <w:pPr>
-        <w:pStyle w:val="Heading4"/>
-        <w:jc w:val="center"/>
-        <w:rPr/>
-      </w:pPr>
-      <w:r>
-        <w:rPr/>
-        <w:t>Programming</w:t>
-      </w:r>
-    </w:p>
-    <w:p>
-      <w:pPr>
-        <w:pStyle w:val="ListBullet2"/>
-        <w:numPr>
-          <w:ilvl w:val="0"/>
-          <w:numId w:val="6"/>
-        </w:numPr>
-        <w:rPr/>
-      </w:pPr>
-      <w:r>
-        <w:rPr/>
-        <w:t>Python</w:t>
-      </w:r>
-    </w:p>
-    <w:p>
-      <w:pPr>
-        <w:pStyle w:val="ListBullet2"/>
-        <w:numPr>
-          <w:ilvl w:val="0"/>
-          <w:numId w:val="6"/>
-        </w:numPr>
-        <w:rPr/>
-      </w:pPr>
-      <w:r>
-        <w:rPr/>
-        <w:t>Go (Golang)</w:t>
-      </w:r>
-    </w:p>
-    <w:p>
-      <w:pPr>
-        <w:pStyle w:val="ListBullet2"/>
-        <w:numPr>
-          <w:ilvl w:val="0"/>
-          <w:numId w:val="6"/>
-        </w:numPr>
-        <w:rPr/>
-      </w:pPr>
-      <w:r>
-        <w:rPr/>
-        <w:t>C</w:t>
-      </w:r>
-    </w:p>
-    <w:p>
-      <w:pPr>
-        <w:pStyle w:val="ListBullet2"/>
-        <w:numPr>
-          <w:ilvl w:val="0"/>
-          <w:numId w:val="6"/>
-        </w:numPr>
-        <w:rPr/>
-      </w:pPr>
-      <w:r>
-        <w:rPr/>
-        <w:t>Java</w:t>
-      </w:r>
-    </w:p>
-    <w:p>
-      <w:pPr>
-        <w:pStyle w:val="ListBullet2"/>
-        <w:numPr>
-          <w:ilvl w:val="0"/>
-          <w:numId w:val="6"/>
-        </w:numPr>
-        <w:rPr/>
-      </w:pPr>
-      <w:r>
-        <w:rPr/>
-        <w:t>JavaScript</w:t>
-      </w:r>
-    </w:p>
-    <w:p>
-      <w:pPr>
-        <w:pStyle w:val="Heading4"/>
-        <w:jc w:val="center"/>
-        <w:rPr/>
-      </w:pPr>
-      <w:r>
-        <w:rPr/>
-        <w:t>Scripting</w:t>
-      </w:r>
-    </w:p>
-    <w:p>
-      <w:pPr>
-        <w:pStyle w:val="ListBullet2"/>
-        <w:numPr>
-          <w:ilvl w:val="0"/>
-          <w:numId w:val="6"/>
-        </w:numPr>
-        <w:rPr/>
-      </w:pPr>
-      <w:r>
-        <w:rPr/>
-        <w:t>Shell</w:t>
-      </w:r>
-    </w:p>
-    <w:p>
-      <w:pPr>
-        <w:pStyle w:val="ListBullet2"/>
-        <w:numPr>
-          <w:ilvl w:val="0"/>
-          <w:numId w:val="6"/>
-        </w:numPr>
-        <w:rPr/>
-      </w:pPr>
-      <w:r>
-        <w:rPr/>
-        <w:t>BASH</w:t>
-      </w:r>
-    </w:p>
-    <w:p>
-      <w:pPr>
-        <w:pStyle w:val="ListBullet2"/>
-        <w:numPr>
-          <w:ilvl w:val="0"/>
-          <w:numId w:val="6"/>
-        </w:numPr>
-        <w:rPr/>
-      </w:pPr>
-      <w:r>
-        <w:rPr/>
-        <w:t>PowerShell</w:t>
-      </w:r>
-    </w:p>
-    <w:p>
-      <w:pPr>
-        <w:pStyle w:val="ListBullet2"/>
-        <w:numPr>
-          <w:ilvl w:val="0"/>
-          <w:numId w:val="6"/>
-        </w:numPr>
-        <w:rPr/>
-      </w:pPr>
-      <w:r>
-        <w:rPr/>
-        <w:t>Nix</w:t>
-      </w:r>
-    </w:p>
-    <w:p>
-      <w:pPr>
-        <w:pStyle w:val="Heading4"/>
-        <w:jc w:val="center"/>
-        <w:rPr/>
-      </w:pPr>
-      <w:r>
-        <w:rPr/>
-        <w:t>Markup</w:t>
-      </w:r>
-    </w:p>
-    <w:p>
-      <w:pPr>
-        <w:pStyle w:val="ListBullet2"/>
-        <w:numPr>
-          <w:ilvl w:val="0"/>
-          <w:numId w:val="6"/>
-        </w:numPr>
-        <w:rPr/>
-      </w:pPr>
-      <w:r>
-        <w:rPr/>
-        <w:t>Markdown</w:t>
-      </w:r>
-    </w:p>
-    <w:p>
-      <w:pPr>
-        <w:pStyle w:val="ListBullet2"/>
-        <w:numPr>
-          <w:ilvl w:val="0"/>
-          <w:numId w:val="6"/>
-        </w:numPr>
-        <w:rPr/>
-      </w:pPr>
-      <w:r>
-        <w:rPr/>
-        <w:t>XML</w:t>
-      </w:r>
-    </w:p>
-    <w:p>
-      <w:pPr>
-        <w:pStyle w:val="ListBullet2"/>
-        <w:numPr>
-          <w:ilvl w:val="0"/>
-          <w:numId w:val="6"/>
-        </w:numPr>
-        <w:rPr/>
-      </w:pPr>
-      <w:r>
-        <w:rPr/>
-        <w:t>HTML</w:t>
-      </w:r>
-    </w:p>
-    <w:p>
-      <w:pPr>
-        <w:pStyle w:val="ListBullet2"/>
-        <w:numPr>
-          <w:ilvl w:val="0"/>
-          <w:numId w:val="6"/>
-        </w:numPr>
-        <w:rPr/>
-      </w:pPr>
-      <w:r>
-        <w:rPr/>
-        <w:t>YAML</w:t>
-      </w:r>
-    </w:p>
-    <w:p>
-      <w:pPr>
-        <w:pStyle w:val="Heading3"/>
-        <w:spacing w:before="0" w:after="0"/>
-        <w:rPr/>
-      </w:pPr>
-      <w:r>
-        <w:br w:type="column"/>
-      </w:r>
-      <w:r>
-        <w:rPr/>
-        <w:t>Orchestration</w:t>
-      </w:r>
-    </w:p>
-    <w:p>
-      <w:pPr>
-        <w:pStyle w:val="Heading4"/>
-        <w:rPr/>
-      </w:pPr>
-      <w:r>
-        <w:rPr/>
-        <w:t>Platforms</w:t>
-      </w:r>
-    </w:p>
-    <w:p>
-      <w:pPr>
-        <w:pStyle w:val="ListBullet2"/>
-        <w:numPr>
-          <w:ilvl w:val="0"/>
-          <w:numId w:val="6"/>
-        </w:numPr>
-        <w:rPr/>
-      </w:pPr>
-      <w:r>
-        <w:rPr/>
-        <w:t>Bare-metal Kubernetes</w:t>
-      </w:r>
-    </w:p>
-    <w:p>
-      <w:pPr>
-        <w:pStyle w:val="ListBullet2"/>
-        <w:numPr>
-          <w:ilvl w:val="0"/>
-          <w:numId w:val="6"/>
-        </w:numPr>
-        <w:rPr/>
-      </w:pPr>
-      <w:r>
-        <w:rPr/>
-        <w:t>Managed Kubernetes</w:t>
-      </w:r>
-    </w:p>
-    <w:p>
-      <w:pPr>
-        <w:pStyle w:val="ListBullet2"/>
-        <w:numPr>
-          <w:ilvl w:val="0"/>
-          <w:numId w:val="6"/>
-        </w:numPr>
-        <w:rPr/>
-      </w:pPr>
-      <w:r>
-        <w:rPr/>
-        <w:t>Docker Enterprise</w:t>
-      </w:r>
-    </w:p>
-    <w:p>
-      <w:pPr>
-        <w:pStyle w:val="ListBullet2"/>
-        <w:numPr>
-          <w:ilvl w:val="0"/>
-          <w:numId w:val="6"/>
-        </w:numPr>
-        <w:rPr/>
-      </w:pPr>
-      <w:r>
-        <w:rPr/>
-        <w:t>Container D</w:t>
-      </w:r>
-    </w:p>
-    <w:p>
-      <w:pPr>
-        <w:pStyle w:val="ListBullet2"/>
-        <w:numPr>
-          <w:ilvl w:val="0"/>
-          <w:numId w:val="6"/>
-        </w:numPr>
-        <w:rPr/>
-      </w:pPr>
-      <w:r>
-        <w:rPr/>
-        <w:t>CRI-O</w:t>
-      </w:r>
-    </w:p>
-    <w:p>
-      <w:pPr>
-        <w:pStyle w:val="Heading4"/>
-        <w:rPr/>
-      </w:pPr>
-      <w:r>
-        <w:rPr/>
-        <w:t>GCP</w:t>
-      </w:r>
-    </w:p>
-    <w:p>
-      <w:pPr>
-        <w:pStyle w:val="ListBullet2"/>
-        <w:numPr>
-          <w:ilvl w:val="0"/>
-          <w:numId w:val="6"/>
-        </w:numPr>
-        <w:rPr/>
-      </w:pPr>
-      <w:r>
-        <w:rPr/>
-        <w:t>Google Kubernetes Engine (Google Kubernetes Engine)</w:t>
-      </w:r>
-    </w:p>
-    <w:p>
-      <w:pPr>
-        <w:pStyle w:val="ListBullet2"/>
-        <w:numPr>
-          <w:ilvl w:val="0"/>
-          <w:numId w:val="6"/>
-        </w:numPr>
-        <w:rPr/>
-      </w:pPr>
-      <w:r>
-        <w:rPr/>
-        <w:t>GCE (Google Compute Engine)</w:t>
-      </w:r>
-    </w:p>
-    <w:p>
-      <w:pPr>
-        <w:pStyle w:val="Heading4"/>
-        <w:rPr/>
-      </w:pPr>
-      <w:r>
-        <w:rPr/>
-        <w:t>AWS</w:t>
-      </w:r>
-    </w:p>
-    <w:p>
-      <w:pPr>
-        <w:pStyle w:val="ListBullet2"/>
-        <w:numPr>
-          <w:ilvl w:val="0"/>
-          <w:numId w:val="6"/>
-        </w:numPr>
-        <w:rPr/>
-      </w:pPr>
-      <w:r>
-        <w:rPr/>
-        <w:t>Elastic Kubernetes Service (Elastic Kubernetes Service)</w:t>
-      </w:r>
-    </w:p>
-    <w:p>
-      <w:pPr>
-        <w:pStyle w:val="ListBullet2"/>
-        <w:numPr>
-          <w:ilvl w:val="0"/>
-          <w:numId w:val="6"/>
-        </w:numPr>
-        <w:rPr/>
-      </w:pPr>
-      <w:r>
-        <w:rPr/>
-        <w:t>ECS (Elastic Container Service)</w:t>
-      </w:r>
-    </w:p>
-    <w:p>
-      <w:pPr>
-        <w:pStyle w:val="ListBullet2"/>
-        <w:numPr>
-          <w:ilvl w:val="0"/>
-          <w:numId w:val="6"/>
-        </w:numPr>
-        <w:rPr/>
-      </w:pPr>
-      <w:r>
-        <w:rPr/>
-        <w:t>EC2 (Elastic Compute Cloud)</w:t>
-      </w:r>
-    </w:p>
-    <w:p>
-      <w:pPr>
-        <w:pStyle w:val="Heading3"/>
-        <w:rPr/>
-      </w:pPr>
-      <w:r>
-        <w:rPr/>
-        <w:t>CI/CD</w:t>
-      </w:r>
-    </w:p>
-    <w:p>
-      <w:pPr>
-        <w:pStyle w:val="Heading4"/>
-        <w:rPr/>
-      </w:pPr>
-      <w:r>
-        <w:rPr/>
-        <w:t>Build/Delivery</w:t>
-      </w:r>
-    </w:p>
-    <w:p>
-      <w:pPr>
-        <w:pStyle w:val="ListBullet2"/>
-        <w:numPr>
-          <w:ilvl w:val="0"/>
-          <w:numId w:val="6"/>
-        </w:numPr>
-        <w:rPr/>
-      </w:pPr>
-      <w:r>
-        <w:rPr/>
-        <w:t>Jenkins</w:t>
-      </w:r>
-    </w:p>
-    <w:p>
-      <w:pPr>
-        <w:pStyle w:val="ListBullet2"/>
-        <w:numPr>
-          <w:ilvl w:val="0"/>
-          <w:numId w:val="6"/>
-        </w:numPr>
-        <w:rPr/>
-      </w:pPr>
-      <w:r>
-        <w:rPr/>
-        <w:t>GitLab CI</w:t>
-      </w:r>
-    </w:p>
-    <w:p>
-      <w:pPr>
-        <w:pStyle w:val="ListBullet2"/>
-        <w:numPr>
-          <w:ilvl w:val="0"/>
-          <w:numId w:val="6"/>
-        </w:numPr>
-        <w:rPr/>
-      </w:pPr>
-      <w:r>
-        <w:rPr/>
-        <w:t>CircleCI</w:t>
-      </w:r>
-    </w:p>
-    <w:p>
-      <w:pPr>
-        <w:pStyle w:val="ListBullet2"/>
-        <w:numPr>
-          <w:ilvl w:val="0"/>
-          <w:numId w:val="6"/>
-        </w:numPr>
-        <w:rPr/>
-      </w:pPr>
-      <w:r>
-        <w:rPr/>
-        <w:t>ArgoCD</w:t>
-      </w:r>
-    </w:p>
-    <w:p>
-      <w:pPr>
-        <w:pStyle w:val="ListBullet2"/>
-        <w:numPr>
-          <w:ilvl w:val="0"/>
-          <w:numId w:val="6"/>
-        </w:numPr>
-        <w:rPr/>
-      </w:pPr>
-      <w:r>
-        <w:rPr/>
-        <w:t>Travis CI</w:t>
-      </w:r>
-    </w:p>
-    <w:p>
-      <w:pPr>
-        <w:pStyle w:val="Heading4"/>
-        <w:rPr/>
-      </w:pPr>
-      <w:r>
-        <w:rPr/>
-        <w:t>Quality</w:t>
-      </w:r>
-    </w:p>
-    <w:p>
-      <w:pPr>
-        <w:pStyle w:val="ListBullet2"/>
-        <w:numPr>
-          <w:ilvl w:val="0"/>
-          <w:numId w:val="6"/>
-        </w:numPr>
-        <w:rPr/>
-      </w:pPr>
-      <w:r>
-        <w:rPr/>
-        <w:t>SonarQube</w:t>
-      </w:r>
-    </w:p>
-    <w:p>
-      <w:pPr>
-        <w:pStyle w:val="ListBullet2"/>
-        <w:numPr>
-          <w:ilvl w:val="0"/>
-          <w:numId w:val="6"/>
-        </w:numPr>
-        <w:rPr/>
-      </w:pPr>
-      <w:r>
-        <w:rPr/>
-        <w:t>Code-Climate</w:t>
-      </w:r>
-    </w:p>
-    <w:p>
-      <w:pPr>
-        <w:pStyle w:val="ListBullet2"/>
-        <w:numPr>
-          <w:ilvl w:val="0"/>
-          <w:numId w:val="6"/>
-        </w:numPr>
-        <w:rPr/>
-      </w:pPr>
-      <w:r>
-        <w:rPr/>
-        <w:t>CodeCov</w:t>
-      </w:r>
-    </w:p>
-    <w:p>
-      <w:pPr>
-        <w:pStyle w:val="Heading3"/>
-        <w:rPr/>
-      </w:pPr>
-      <w:r>
-        <w:rPr/>
-        <w:t>Software Development Life Cycle</w:t>
-      </w:r>
-    </w:p>
-    <w:p>
-      <w:pPr>
-        <w:pStyle w:val="Heading4"/>
-        <w:rPr/>
-      </w:pPr>
-      <w:r>
-        <w:rPr/>
-        <w:t>Agile</w:t>
-      </w:r>
-    </w:p>
-    <w:p>
-      <w:pPr>
-        <w:pStyle w:val="ListBullet2"/>
-        <w:numPr>
-          <w:ilvl w:val="0"/>
-          <w:numId w:val="6"/>
-        </w:numPr>
-        <w:rPr/>
-      </w:pPr>
-      <w:r>
-        <w:rPr/>
-        <w:t>SCRUM</w:t>
-      </w:r>
-    </w:p>
-    <w:p>
-      <w:pPr>
-        <w:pStyle w:val="ListBullet2"/>
-        <w:numPr>
-          <w:ilvl w:val="0"/>
-          <w:numId w:val="6"/>
-        </w:numPr>
-        <w:rPr/>
-      </w:pPr>
-      <w:r>
-        <w:rPr/>
-        <w:t>Branching Models</w:t>
-      </w:r>
-    </w:p>
-    <w:p>
-      <w:pPr>
-        <w:pStyle w:val="Heading4"/>
-        <w:rPr/>
-      </w:pPr>
-      <w:r>
-        <w:rPr/>
-        <w:t>Waterfall</w:t>
-      </w:r>
-    </w:p>
-    <w:p>
-      <w:pPr>
-        <w:pStyle w:val="ListBullet2"/>
-        <w:numPr>
-          <w:ilvl w:val="0"/>
-          <w:numId w:val="6"/>
-        </w:numPr>
-        <w:rPr/>
-      </w:pPr>
-      <w:r>
-        <w:rPr/>
-        <w:t>Semantic Versioning</w:t>
-      </w:r>
-    </w:p>
-    <w:p>
-      <w:pPr>
-        <w:pStyle w:val="ListBullet2"/>
-        <w:numPr>
-          <w:ilvl w:val="0"/>
-          <w:numId w:val="6"/>
-        </w:numPr>
-        <w:rPr/>
-      </w:pPr>
-      <w:r>
-        <w:rPr/>
-        <w:t>Release Cycles</w:t>
-      </w:r>
-    </w:p>
-    <w:p>
-      <w:pPr>
-        <w:pStyle w:val="ListBullet2"/>
-        <w:numPr>
-          <w:ilvl w:val="0"/>
-          <w:numId w:val="6"/>
-        </w:numPr>
-        <w:rPr/>
-      </w:pPr>
-      <w:r>
-        <w:rPr/>
-        <w:t>Commit Cycles</w:t>
-      </w:r>
-    </w:p>
-    <w:p>
-      <w:pPr>
-        <w:sectPr>
-          <w:type w:val="continuous"/>
-          <w:pgSz w:w="12240" w:h="15840"/>
-          <w:pgMar w:left="1440" w:right="1440" w:gutter="0" w:header="0" w:top="1440" w:footer="1440" w:bottom="1642"/>
-          <w:cols w:num="3" w:space="144" w:equalWidth="true" w:sep="false"/>
           <w:formProt w:val="false"/>
           <w:textDirection w:val="lrTb"/>
           <w:docGrid w:type="default" w:linePitch="360" w:charSpace="0"/>
@@ -3577,7 +3060,7 @@
 <w:ftr xmlns:o="urn:schemas-microsoft-com:office:office" xmlns:r="http://schemas.openxmlformats.org/officeDocument/2006/relationships" xmlns:v="urn:schemas-microsoft-com:vml" xmlns:w="http://schemas.openxmlformats.org/wordprocessingml/2006/main" xmlns:w10="urn:schemas-microsoft-com:office:word" xmlns:wp="http://schemas.openxmlformats.org/drawingml/2006/wordprocessingDrawing" xmlns:pic="http://schemas.openxmlformats.org/drawingml/2006/picture" xmlns:wps="http://schemas.microsoft.com/office/word/2010/wordprocessingShape" xmlns:wpg="http://schemas.microsoft.com/office/word/2010/wordprocessingGroup" xmlns:mc="http://schemas.openxmlformats.org/markup-compatibility/2006" xmlns:wp14="http://schemas.microsoft.com/office/word/2010/wordprocessingDrawing" xmlns:w14="http://schemas.microsoft.com/office/word/2010/wordml" xmlns:w15="http://schemas.microsoft.com/office/word/2012/wordml" mc:Ignorable="w14 wp14 w15">
   <w:p>
     <w:pPr>
-      <w:pStyle w:val="FooterLeft"/>
+      <w:pStyle w:val="FooterLeftuser"/>
       <w:rPr/>
     </w:pPr>
     <w:r>
@@ -3592,7 +3075,7 @@
 <w:ftr xmlns:o="urn:schemas-microsoft-com:office:office" xmlns:r="http://schemas.openxmlformats.org/officeDocument/2006/relationships" xmlns:v="urn:schemas-microsoft-com:vml" xmlns:w="http://schemas.openxmlformats.org/wordprocessingml/2006/main" xmlns:w10="urn:schemas-microsoft-com:office:word" xmlns:wp="http://schemas.openxmlformats.org/drawingml/2006/wordprocessingDrawing" xmlns:pic="http://schemas.openxmlformats.org/drawingml/2006/picture" xmlns:wps="http://schemas.microsoft.com/office/word/2010/wordprocessingShape" xmlns:wpg="http://schemas.microsoft.com/office/word/2010/wordprocessingGroup" xmlns:mc="http://schemas.openxmlformats.org/markup-compatibility/2006" xmlns:wp14="http://schemas.microsoft.com/office/word/2010/wordprocessingDrawing" xmlns:w14="http://schemas.microsoft.com/office/word/2010/wordml" xmlns:w15="http://schemas.microsoft.com/office/word/2012/wordml" mc:Ignorable="w14 wp14 w15">
   <w:p>
     <w:pPr>
-      <w:pStyle w:val="FooterLeft"/>
+      <w:pStyle w:val="FooterLeftuser"/>
       <w:rPr/>
     </w:pPr>
     <w:r>
@@ -5178,7 +4661,7 @@
     <w:pPr>
       <w:keepNext w:val="true"/>
       <w:keepLines/>
-      <w:jc w:val="center"/>
+      <w:jc w:val="start"/>
       <w:outlineLvl w:val="3"/>
     </w:pPr>
     <w:rPr>
@@ -5608,15 +5091,15 @@
     <w:qFormat/>
     <w:rPr/>
   </w:style>
-  <w:style w:type="character" w:styleId="Bulletsuser">
-    <w:name w:val="Bullets (user)"/>
+  <w:style w:type="character" w:styleId="Bullets">
+    <w:name w:val="Bullets"/>
     <w:qFormat/>
     <w:rPr>
       <w:rFonts w:ascii="OpenSymbol" w:hAnsi="OpenSymbol" w:eastAsia="OpenSymbol" w:cs="OpenSymbol"/>
     </w:rPr>
   </w:style>
-  <w:style w:type="character" w:styleId="Bullets">
-    <w:name w:val="Bullets"/>
+  <w:style w:type="character" w:styleId="Bulletsuser">
+    <w:name w:val="Bullets (user)"/>
     <w:qFormat/>
     <w:rPr>
       <w:rFonts w:ascii="OpenSymbol" w:hAnsi="OpenSymbol" w:eastAsia="OpenSymbol" w:cs="OpenSymbol"/>
@@ -5953,8 +5436,8 @@
       <w:rFonts w:ascii="times" w:hAnsi="times"/>
     </w:rPr>
   </w:style>
-  <w:style w:type="paragraph" w:styleId="FrameContentsuser">
-    <w:name w:val="Frame Contents (user)"/>
+  <w:style w:type="paragraph" w:styleId="FrameContents">
+    <w:name w:val="Frame Contents"/>
     <w:basedOn w:val="Normal"/>
     <w:qFormat/>
     <w:pPr/>
@@ -5990,8 +5473,8 @@
     </w:pPr>
     <w:rPr/>
   </w:style>
-  <w:style w:type="paragraph" w:styleId="FooterLeft">
-    <w:name w:val="Footer Left"/>
+  <w:style w:type="paragraph" w:styleId="FooterLeftuser">
+    <w:name w:val="Footer Left (user)"/>
     <w:basedOn w:val="Footer"/>
     <w:qFormat/>
     <w:pPr>
@@ -6015,12 +5498,26 @@
       <w:bCs/>
     </w:rPr>
   </w:style>
-  <w:style w:type="paragraph" w:styleId="FrameContents">
-    <w:name w:val="Frame Contents"/>
+  <w:style w:type="paragraph" w:styleId="FrameContentsuser">
+    <w:name w:val="Frame Contents (user)"/>
     <w:basedOn w:val="Normal"/>
     <w:qFormat/>
     <w:pPr/>
     <w:rPr/>
+  </w:style>
+  <w:style w:type="paragraph" w:styleId="PreformattedText">
+    <w:name w:val="Preformatted Text"/>
+    <w:basedOn w:val="Normal"/>
+    <w:qFormat/>
+    <w:pPr>
+      <w:keepLines/>
+      <w:spacing w:before="0" w:after="0"/>
+    </w:pPr>
+    <w:rPr>
+      <w:rFonts w:ascii="Liberation Mono" w:hAnsi="Liberation Mono" w:eastAsia="Liberation Mono" w:cs="Liberation Mono"/>
+      <w:sz w:val="14"/>
+      <w:szCs w:val="20"/>
+    </w:rPr>
   </w:style>
   <w:style w:type="numbering" w:styleId="NoList" w:default="1">
     <w:name w:val="No List"/>
@@ -6059,8 +5556,8 @@
     <w:qFormat/>
     <w:rsid w:val="00512907"/>
   </w:style>
-  <w:style w:type="numbering" w:styleId="Bulletuser">
-    <w:name w:val="Bullet • (user)"/>
+  <w:style w:type="numbering" w:styleId="Bullet">
+    <w:name w:val="Bullet •"/>
     <w:qFormat/>
   </w:style>
   <w:style w:type="table" w:default="1" w:styleId="TableNormal">

</xml_diff>